<commit_message>
Update РСП БАСР.00359-01 32 01.docx
</commit_message>
<xml_diff>
--- a/docs/РСП БАСР.00359-01 32 01.docx
+++ b/docs/РСП БАСР.00359-01 32 01.docx
@@ -299,7 +299,25 @@
                 <w:sz w:val="24"/>
                 <w:szCs w:val="24"/>
               </w:rPr>
-              <w:t>«___»__________ 20</w:t>
+              <w:t>«__</w:t>
+            </w:r>
+            <w:proofErr w:type="gramStart"/>
+            <w:r>
+              <w:rPr>
+                <w:color w:val="FFFFFF"/>
+                <w:sz w:val="24"/>
+                <w:szCs w:val="24"/>
+              </w:rPr>
+              <w:t>_»_</w:t>
+            </w:r>
+            <w:proofErr w:type="gramEnd"/>
+            <w:r>
+              <w:rPr>
+                <w:color w:val="FFFFFF"/>
+                <w:sz w:val="24"/>
+                <w:szCs w:val="24"/>
+              </w:rPr>
+              <w:t>_________ 20</w:t>
             </w:r>
             <w:r>
               <w:rPr>
@@ -401,7 +419,23 @@
                 <w:sz w:val="24"/>
                 <w:szCs w:val="24"/>
               </w:rPr>
-              <w:t xml:space="preserve">         « ____ » ___________ </w:t>
+              <w:t xml:space="preserve">         </w:t>
+            </w:r>
+            <w:proofErr w:type="gramStart"/>
+            <w:r>
+              <w:rPr>
+                <w:sz w:val="24"/>
+                <w:szCs w:val="24"/>
+              </w:rPr>
+              <w:t>« _</w:t>
+            </w:r>
+            <w:proofErr w:type="gramEnd"/>
+            <w:r>
+              <w:rPr>
+                <w:sz w:val="24"/>
+                <w:szCs w:val="24"/>
+              </w:rPr>
+              <w:t xml:space="preserve">___ » ___________ </w:t>
             </w:r>
             <w:r>
               <w:rPr>
@@ -2172,7 +2206,23 @@
                 <w:sz w:val="24"/>
                 <w:szCs w:val="24"/>
               </w:rPr>
-              <w:t xml:space="preserve">«___»_________ </w:t>
+              <w:t>«__</w:t>
+            </w:r>
+            <w:proofErr w:type="gramStart"/>
+            <w:r>
+              <w:rPr>
+                <w:sz w:val="24"/>
+                <w:szCs w:val="24"/>
+              </w:rPr>
+              <w:t>_»_</w:t>
+            </w:r>
+            <w:proofErr w:type="gramEnd"/>
+            <w:r>
+              <w:rPr>
+                <w:sz w:val="24"/>
+                <w:szCs w:val="24"/>
+              </w:rPr>
+              <w:t xml:space="preserve">________ </w:t>
             </w:r>
             <w:r>
               <w:rPr>
@@ -2273,7 +2323,23 @@
                 <w:sz w:val="24"/>
                 <w:szCs w:val="24"/>
               </w:rPr>
-              <w:t xml:space="preserve">«___»________ </w:t>
+              <w:t>«__</w:t>
+            </w:r>
+            <w:proofErr w:type="gramStart"/>
+            <w:r>
+              <w:rPr>
+                <w:sz w:val="24"/>
+                <w:szCs w:val="24"/>
+              </w:rPr>
+              <w:t>_»_</w:t>
+            </w:r>
+            <w:proofErr w:type="gramEnd"/>
+            <w:r>
+              <w:rPr>
+                <w:sz w:val="24"/>
+                <w:szCs w:val="24"/>
+              </w:rPr>
+              <w:t xml:space="preserve">_______ </w:t>
             </w:r>
             <w:r>
               <w:rPr>
@@ -2392,7 +2458,23 @@
                 <w:sz w:val="24"/>
                 <w:szCs w:val="24"/>
               </w:rPr>
-              <w:t xml:space="preserve">«___»________ </w:t>
+              <w:t>«__</w:t>
+            </w:r>
+            <w:proofErr w:type="gramStart"/>
+            <w:r>
+              <w:rPr>
+                <w:sz w:val="24"/>
+                <w:szCs w:val="24"/>
+              </w:rPr>
+              <w:t>_»_</w:t>
+            </w:r>
+            <w:proofErr w:type="gramEnd"/>
+            <w:r>
+              <w:rPr>
+                <w:sz w:val="24"/>
+                <w:szCs w:val="24"/>
+              </w:rPr>
+              <w:t xml:space="preserve">_______ </w:t>
             </w:r>
             <w:r>
               <w:rPr>
@@ -3892,14 +3974,27 @@
       <w:r>
         <w:t xml:space="preserve"> </w:t>
       </w:r>
-      <w:fldSimple w:instr=" NUMPAGES   \* MERGEFORMAT ">
-        <w:r>
-          <w:rPr>
-            <w:noProof/>
-          </w:rPr>
-          <w:t>43</w:t>
-        </w:r>
-      </w:fldSimple>
+      <w:r>
+        <w:fldChar w:fldCharType="begin"/>
+      </w:r>
+      <w:r>
+        <w:instrText xml:space="preserve"> NUMPAGES   \* MERGEFORMAT </w:instrText>
+      </w:r>
+      <w:r>
+        <w:fldChar w:fldCharType="separate"/>
+      </w:r>
+      <w:r>
+        <w:rPr>
+          <w:noProof/>
+        </w:rPr>
+        <w:t>16</w:t>
+      </w:r>
+      <w:r>
+        <w:rPr>
+          <w:noProof/>
+        </w:rPr>
+        <w:fldChar w:fldCharType="end"/>
+      </w:r>
     </w:p>
     <w:p>
       <w:pPr>
@@ -4224,7 +4319,7 @@
           <w:szCs w:val="28"/>
         </w:rPr>
       </w:pPr>
-      <w:bookmarkStart w:id="1" w:name="_Toc215163914"/>
+      <w:bookmarkStart w:id="1" w:name="_Toc215168239"/>
       <w:bookmarkEnd w:id="0"/>
       <w:r>
         <w:rPr>
@@ -4518,7 +4613,7 @@
         </w:rPr>
         <w:fldChar w:fldCharType="separate"/>
       </w:r>
-      <w:hyperlink w:anchor="_Toc215163914" w:history="1">
+      <w:hyperlink w:anchor="_Toc215168239" w:history="1">
         <w:r>
           <w:rPr>
             <w:rStyle w:val="af8"/>
@@ -4542,7 +4637,7 @@
           <w:rPr>
             <w:webHidden/>
           </w:rPr>
-          <w:instrText xml:space="preserve"> PAGEREF _Toc215163914 \h </w:instrText>
+          <w:instrText xml:space="preserve"> PAGEREF _Toc215168239 \h </w:instrText>
         </w:r>
         <w:r>
           <w:rPr>
@@ -4579,7 +4674,7 @@
           <w:szCs w:val="22"/>
         </w:rPr>
       </w:pPr>
-      <w:hyperlink w:anchor="_Toc215163915" w:history="1">
+      <w:hyperlink w:anchor="_Toc215168240" w:history="1">
         <w:r>
           <w:rPr>
             <w:rStyle w:val="af8"/>
@@ -4619,7 +4714,7 @@
           <w:rPr>
             <w:webHidden/>
           </w:rPr>
-          <w:instrText xml:space="preserve"> PAGEREF _Toc215163915 \h </w:instrText>
+          <w:instrText xml:space="preserve"> PAGEREF _Toc215168240 \h </w:instrText>
         </w:r>
         <w:r>
           <w:rPr>
@@ -4656,7 +4751,7 @@
           <w:szCs w:val="22"/>
         </w:rPr>
       </w:pPr>
-      <w:hyperlink w:anchor="_Toc215163916" w:history="1">
+      <w:hyperlink w:anchor="_Toc215168241" w:history="1">
         <w:r>
           <w:rPr>
             <w:rStyle w:val="af8"/>
@@ -4680,7 +4775,7 @@
           <w:rPr>
             <w:webHidden/>
           </w:rPr>
-          <w:instrText xml:space="preserve"> PAGEREF _Toc215163916 \h </w:instrText>
+          <w:instrText xml:space="preserve"> PAGEREF _Toc215168241 \h </w:instrText>
         </w:r>
         <w:r>
           <w:rPr>
@@ -4717,7 +4812,7 @@
           <w:szCs w:val="22"/>
         </w:rPr>
       </w:pPr>
-      <w:hyperlink w:anchor="_Toc215163917" w:history="1">
+      <w:hyperlink w:anchor="_Toc215168242" w:history="1">
         <w:r>
           <w:rPr>
             <w:rStyle w:val="af8"/>
@@ -4746,7 +4841,7 @@
             <w:noProof/>
             <w:webHidden/>
           </w:rPr>
-          <w:instrText xml:space="preserve"> PAGEREF _Toc215163917 \h </w:instrText>
+          <w:instrText xml:space="preserve"> PAGEREF _Toc215168242 \h </w:instrText>
         </w:r>
         <w:r>
           <w:rPr>
@@ -4787,12 +4882,13 @@
           <w:szCs w:val="22"/>
         </w:rPr>
       </w:pPr>
-      <w:hyperlink w:anchor="_Toc215163918" w:history="1">
+      <w:hyperlink w:anchor="_Toc215168243" w:history="1">
         <w:r>
           <w:rPr>
             <w:rStyle w:val="af8"/>
             <w:bCs/>
             <w:noProof/>
+            <w:highlight w:val="yellow"/>
             <w:lang w:eastAsia="en-US"/>
           </w:rPr>
           <w:t>2.2 Связи между составными частями программы</w:t>
@@ -4816,7 +4912,7 @@
             <w:noProof/>
             <w:webHidden/>
           </w:rPr>
-          <w:instrText xml:space="preserve"> PAGEREF _Toc215163918 \h </w:instrText>
+          <w:instrText xml:space="preserve"> PAGEREF _Toc215168243 \h </w:instrText>
         </w:r>
         <w:r>
           <w:rPr>
@@ -4857,7 +4953,7 @@
           <w:szCs w:val="22"/>
         </w:rPr>
       </w:pPr>
-      <w:hyperlink w:anchor="_Toc215163919" w:history="1">
+      <w:hyperlink w:anchor="_Toc215168244" w:history="1">
         <w:r>
           <w:rPr>
             <w:rStyle w:val="af8"/>
@@ -4886,7 +4982,7 @@
             <w:noProof/>
             <w:webHidden/>
           </w:rPr>
-          <w:instrText xml:space="preserve"> PAGEREF _Toc215163919 \h </w:instrText>
+          <w:instrText xml:space="preserve"> PAGEREF _Toc215168244 \h </w:instrText>
         </w:r>
         <w:r>
           <w:rPr>
@@ -4927,7 +5023,7 @@
           <w:szCs w:val="22"/>
         </w:rPr>
       </w:pPr>
-      <w:hyperlink w:anchor="_Toc215163920" w:history="1">
+      <w:hyperlink w:anchor="_Toc215168245" w:history="1">
         <w:r>
           <w:rPr>
             <w:rStyle w:val="af8"/>
@@ -4951,7 +5047,7 @@
           <w:rPr>
             <w:webHidden/>
           </w:rPr>
-          <w:instrText xml:space="preserve"> PAGEREF _Toc215163920 \h </w:instrText>
+          <w:instrText xml:space="preserve"> PAGEREF _Toc215168245 \h </w:instrText>
         </w:r>
         <w:r>
           <w:rPr>
@@ -4988,7 +5084,7 @@
           <w:szCs w:val="22"/>
         </w:rPr>
       </w:pPr>
-      <w:hyperlink w:anchor="_Toc215163921" w:history="1">
+      <w:hyperlink w:anchor="_Toc215168246" w:history="1">
         <w:r>
           <w:rPr>
             <w:rStyle w:val="af8"/>
@@ -5012,7 +5108,7 @@
           <w:rPr>
             <w:webHidden/>
           </w:rPr>
-          <w:instrText xml:space="preserve"> PAGEREF _Toc215163921 \h </w:instrText>
+          <w:instrText xml:space="preserve"> PAGEREF _Toc215168246 \h </w:instrText>
         </w:r>
         <w:r>
           <w:rPr>
@@ -5049,7 +5145,7 @@
           <w:szCs w:val="22"/>
         </w:rPr>
       </w:pPr>
-      <w:hyperlink w:anchor="_Toc215163922" w:history="1">
+      <w:hyperlink w:anchor="_Toc215168247" w:history="1">
         <w:r>
           <w:rPr>
             <w:rStyle w:val="af8"/>
@@ -5080,7 +5176,7 @@
           <w:rPr>
             <w:webHidden/>
           </w:rPr>
-          <w:instrText xml:space="preserve"> PAGEREF _Toc215163922 \h </w:instrText>
+          <w:instrText xml:space="preserve"> PAGEREF _Toc215168247 \h </w:instrText>
         </w:r>
         <w:r>
           <w:rPr>
@@ -5097,7 +5193,7 @@
           <w:rPr>
             <w:webHidden/>
           </w:rPr>
-          <w:t>19</w:t>
+          <w:t>13</w:t>
         </w:r>
         <w:r>
           <w:rPr>
@@ -5109,286 +5205,6 @@
     </w:p>
     <w:p>
       <w:pPr>
-        <w:pStyle w:val="22"/>
-        <w:rPr>
-          <w:rFonts w:asciiTheme="minorHAnsi" w:eastAsiaTheme="minorEastAsia" w:hAnsiTheme="minorHAnsi" w:cstheme="minorBidi"/>
-          <w:noProof/>
-          <w:sz w:val="22"/>
-          <w:szCs w:val="22"/>
-        </w:rPr>
-      </w:pPr>
-      <w:hyperlink w:anchor="_Toc215163923" w:history="1">
-        <w:r>
-          <w:rPr>
-            <w:rStyle w:val="af8"/>
-            <w:bCs/>
-            <w:noProof/>
-            <w:lang w:eastAsia="en-US"/>
-          </w:rPr>
-          <w:t>5.1 Работа со спектральными библиотеками</w:t>
-        </w:r>
-        <w:r>
-          <w:rPr>
-            <w:noProof/>
-            <w:webHidden/>
-          </w:rPr>
-          <w:tab/>
-        </w:r>
-        <w:r>
-          <w:rPr>
-            <w:noProof/>
-            <w:webHidden/>
-          </w:rPr>
-          <w:fldChar w:fldCharType="begin"/>
-        </w:r>
-        <w:r>
-          <w:rPr>
-            <w:noProof/>
-            <w:webHidden/>
-          </w:rPr>
-          <w:instrText xml:space="preserve"> PAGEREF _Toc215163923 \h </w:instrText>
-        </w:r>
-        <w:r>
-          <w:rPr>
-            <w:noProof/>
-            <w:webHidden/>
-          </w:rPr>
-        </w:r>
-        <w:r>
-          <w:rPr>
-            <w:noProof/>
-            <w:webHidden/>
-          </w:rPr>
-          <w:fldChar w:fldCharType="separate"/>
-        </w:r>
-        <w:r>
-          <w:rPr>
-            <w:noProof/>
-            <w:webHidden/>
-          </w:rPr>
-          <w:t>19</w:t>
-        </w:r>
-        <w:r>
-          <w:rPr>
-            <w:noProof/>
-            <w:webHidden/>
-          </w:rPr>
-          <w:fldChar w:fldCharType="end"/>
-        </w:r>
-      </w:hyperlink>
-    </w:p>
-    <w:p>
-      <w:pPr>
-        <w:pStyle w:val="22"/>
-        <w:rPr>
-          <w:rFonts w:asciiTheme="minorHAnsi" w:eastAsiaTheme="minorEastAsia" w:hAnsiTheme="minorHAnsi" w:cstheme="minorBidi"/>
-          <w:noProof/>
-          <w:sz w:val="22"/>
-          <w:szCs w:val="22"/>
-        </w:rPr>
-      </w:pPr>
-      <w:hyperlink w:anchor="_Toc215163924" w:history="1">
-        <w:r>
-          <w:rPr>
-            <w:rStyle w:val="af8"/>
-            <w:bCs/>
-            <w:noProof/>
-            <w:lang w:eastAsia="en-US"/>
-          </w:rPr>
-          <w:t>5.2 Атмосферная коррекция данных ФСС</w:t>
-        </w:r>
-        <w:r>
-          <w:rPr>
-            <w:noProof/>
-            <w:webHidden/>
-          </w:rPr>
-          <w:tab/>
-        </w:r>
-        <w:r>
-          <w:rPr>
-            <w:noProof/>
-            <w:webHidden/>
-          </w:rPr>
-          <w:fldChar w:fldCharType="begin"/>
-        </w:r>
-        <w:r>
-          <w:rPr>
-            <w:noProof/>
-            <w:webHidden/>
-          </w:rPr>
-          <w:instrText xml:space="preserve"> PAGEREF _Toc215163924 \h </w:instrText>
-        </w:r>
-        <w:r>
-          <w:rPr>
-            <w:noProof/>
-            <w:webHidden/>
-          </w:rPr>
-        </w:r>
-        <w:r>
-          <w:rPr>
-            <w:noProof/>
-            <w:webHidden/>
-          </w:rPr>
-          <w:fldChar w:fldCharType="separate"/>
-        </w:r>
-        <w:r>
-          <w:rPr>
-            <w:noProof/>
-            <w:webHidden/>
-          </w:rPr>
-          <w:t>26</w:t>
-        </w:r>
-        <w:r>
-          <w:rPr>
-            <w:noProof/>
-            <w:webHidden/>
-          </w:rPr>
-          <w:fldChar w:fldCharType="end"/>
-        </w:r>
-      </w:hyperlink>
-    </w:p>
-    <w:p>
-      <w:pPr>
-        <w:pStyle w:val="22"/>
-        <w:rPr>
-          <w:rFonts w:asciiTheme="minorHAnsi" w:eastAsiaTheme="minorEastAsia" w:hAnsiTheme="minorHAnsi" w:cstheme="minorBidi"/>
-          <w:noProof/>
-          <w:sz w:val="22"/>
-          <w:szCs w:val="22"/>
-        </w:rPr>
-      </w:pPr>
-      <w:hyperlink w:anchor="_Toc215163925" w:history="1">
-        <w:r>
-          <w:rPr>
-            <w:rStyle w:val="af8"/>
-            <w:bCs/>
-            <w:noProof/>
-            <w:lang w:eastAsia="en-US"/>
-          </w:rPr>
-          <w:t>5.3 Тематическая обработка спектральных данных</w:t>
-        </w:r>
-        <w:r>
-          <w:rPr>
-            <w:noProof/>
-            <w:webHidden/>
-          </w:rPr>
-          <w:tab/>
-        </w:r>
-        <w:r>
-          <w:rPr>
-            <w:noProof/>
-            <w:webHidden/>
-          </w:rPr>
-          <w:fldChar w:fldCharType="begin"/>
-        </w:r>
-        <w:r>
-          <w:rPr>
-            <w:noProof/>
-            <w:webHidden/>
-          </w:rPr>
-          <w:instrText xml:space="preserve"> PAGEREF _Toc215163925 \h </w:instrText>
-        </w:r>
-        <w:r>
-          <w:rPr>
-            <w:noProof/>
-            <w:webHidden/>
-          </w:rPr>
-        </w:r>
-        <w:r>
-          <w:rPr>
-            <w:noProof/>
-            <w:webHidden/>
-          </w:rPr>
-          <w:fldChar w:fldCharType="separate"/>
-        </w:r>
-        <w:r>
-          <w:rPr>
-            <w:noProof/>
-            <w:webHidden/>
-          </w:rPr>
-          <w:t>29</w:t>
-        </w:r>
-        <w:r>
-          <w:rPr>
-            <w:noProof/>
-            <w:webHidden/>
-          </w:rPr>
-          <w:fldChar w:fldCharType="end"/>
-        </w:r>
-      </w:hyperlink>
-    </w:p>
-    <w:p>
-      <w:pPr>
-        <w:pStyle w:val="22"/>
-        <w:rPr>
-          <w:rFonts w:asciiTheme="minorHAnsi" w:eastAsiaTheme="minorEastAsia" w:hAnsiTheme="minorHAnsi" w:cstheme="minorBidi"/>
-          <w:noProof/>
-          <w:sz w:val="22"/>
-          <w:szCs w:val="22"/>
-        </w:rPr>
-      </w:pPr>
-      <w:hyperlink w:anchor="_Toc215163926" w:history="1">
-        <w:r>
-          <w:rPr>
-            <w:rStyle w:val="af8"/>
-            <w:bCs/>
-            <w:noProof/>
-            <w:lang w:eastAsia="en-US"/>
-          </w:rPr>
-          <w:t>5.4 Тематическая обработка изображений</w:t>
-        </w:r>
-        <w:r>
-          <w:rPr>
-            <w:noProof/>
-            <w:webHidden/>
-          </w:rPr>
-          <w:tab/>
-        </w:r>
-        <w:r>
-          <w:rPr>
-            <w:noProof/>
-            <w:webHidden/>
-          </w:rPr>
-          <w:fldChar w:fldCharType="begin"/>
-        </w:r>
-        <w:r>
-          <w:rPr>
-            <w:noProof/>
-            <w:webHidden/>
-          </w:rPr>
-          <w:instrText xml:space="preserve"> PAGEREF _Toc215163926 \h </w:instrText>
-        </w:r>
-        <w:r>
-          <w:rPr>
-            <w:noProof/>
-            <w:webHidden/>
-          </w:rPr>
-        </w:r>
-        <w:r>
-          <w:rPr>
-            <w:noProof/>
-            <w:webHidden/>
-          </w:rPr>
-          <w:fldChar w:fldCharType="separate"/>
-        </w:r>
-        <w:r>
-          <w:rPr>
-            <w:noProof/>
-            <w:webHidden/>
-          </w:rPr>
-          <w:t>31</w:t>
-        </w:r>
-        <w:r>
-          <w:rPr>
-            <w:noProof/>
-            <w:webHidden/>
-          </w:rPr>
-          <w:fldChar w:fldCharType="end"/>
-        </w:r>
-      </w:hyperlink>
-    </w:p>
-    <w:p>
-      <w:pPr>
         <w:pStyle w:val="12"/>
         <w:rPr>
           <w:rFonts w:asciiTheme="minorHAnsi" w:eastAsiaTheme="minorEastAsia" w:hAnsiTheme="minorHAnsi" w:cstheme="minorBidi"/>
@@ -5397,7 +5213,7 @@
           <w:szCs w:val="22"/>
         </w:rPr>
       </w:pPr>
-      <w:hyperlink w:anchor="_Toc215163927" w:history="1">
+      <w:hyperlink w:anchor="_Toc215168248" w:history="1">
         <w:r>
           <w:rPr>
             <w:rStyle w:val="af8"/>
@@ -5428,7 +5244,7 @@
           <w:rPr>
             <w:webHidden/>
           </w:rPr>
-          <w:instrText xml:space="preserve"> PAGEREF _Toc215163927 \h </w:instrText>
+          <w:instrText xml:space="preserve"> PAGEREF _Toc215168248 \h </w:instrText>
         </w:r>
         <w:r>
           <w:rPr>
@@ -5445,7 +5261,7 @@
           <w:rPr>
             <w:webHidden/>
           </w:rPr>
-          <w:t>41</w:t>
+          <w:t>14</w:t>
         </w:r>
         <w:r>
           <w:rPr>
@@ -5465,7 +5281,7 @@
           <w:szCs w:val="22"/>
         </w:rPr>
       </w:pPr>
-      <w:hyperlink w:anchor="_Toc215163928" w:history="1">
+      <w:hyperlink w:anchor="_Toc215168249" w:history="1">
         <w:r>
           <w:rPr>
             <w:rStyle w:val="af8"/>
@@ -5488,7 +5304,7 @@
           <w:rPr>
             <w:webHidden/>
           </w:rPr>
-          <w:instrText xml:space="preserve"> PAGEREF _Toc215163928 \h </w:instrText>
+          <w:instrText xml:space="preserve"> PAGEREF _Toc215168249 \h </w:instrText>
         </w:r>
         <w:r>
           <w:rPr>
@@ -5505,7 +5321,7 @@
           <w:rPr>
             <w:webHidden/>
           </w:rPr>
-          <w:t>42</w:t>
+          <w:t>15</w:t>
         </w:r>
         <w:r>
           <w:rPr>
@@ -5932,18 +5748,7 @@
           <w:szCs w:val="28"/>
         </w:rPr>
         <w:tab/>
-      </w:r>
-      <w:r>
-        <w:rPr>
-          <w:szCs w:val="28"/>
-        </w:rPr>
-        <w:t xml:space="preserve">– </w:t>
-      </w:r>
-      <w:r>
-        <w:rPr>
-          <w:szCs w:val="28"/>
-        </w:rPr>
-        <w:t xml:space="preserve">коэффициент спектральной яркости </w:t>
+        <w:t xml:space="preserve">– коэффициент спектральной яркости </w:t>
       </w:r>
     </w:p>
     <w:p>
@@ -6045,7 +5850,7 @@
           <w:szCs w:val="28"/>
         </w:rPr>
       </w:pPr>
-      <w:bookmarkStart w:id="10" w:name="_Toc215163915"/>
+      <w:bookmarkStart w:id="10" w:name="_Toc215168240"/>
       <w:r>
         <w:rPr>
           <w:kern w:val="32"/>
@@ -6162,7 +5967,7 @@
           <w:szCs w:val="28"/>
         </w:rPr>
       </w:pPr>
-      <w:bookmarkStart w:id="12" w:name="_Toc215163916"/>
+      <w:bookmarkStart w:id="12" w:name="_Toc215168241"/>
       <w:r>
         <w:rPr>
           <w:kern w:val="32"/>
@@ -6186,7 +5991,7 @@
           <w:lang w:eastAsia="en-US"/>
         </w:rPr>
       </w:pPr>
-      <w:bookmarkStart w:id="13" w:name="_Toc215163917"/>
+      <w:bookmarkStart w:id="13" w:name="_Toc215168242"/>
       <w:r>
         <w:rPr>
           <w:bCs/>
@@ -6615,7 +6420,7 @@
           <w:lang w:eastAsia="en-US"/>
         </w:rPr>
       </w:pPr>
-      <w:bookmarkStart w:id="14" w:name="_Toc215163918"/>
+      <w:bookmarkStart w:id="14" w:name="_Toc215168243"/>
       <w:r>
         <w:rPr>
           <w:bCs/>
@@ -6654,7 +6459,7 @@
           <w:lang w:val="uk-UA"/>
         </w:rPr>
       </w:pPr>
-      <w:bookmarkStart w:id="15" w:name="_Toc215163919"/>
+      <w:bookmarkStart w:id="15" w:name="_Toc215168244"/>
       <w:r>
         <w:rPr>
           <w:bCs/>
@@ -6804,7 +6609,7 @@
           <w:szCs w:val="28"/>
         </w:rPr>
       </w:pPr>
-      <w:bookmarkStart w:id="16" w:name="_Toc215163920"/>
+      <w:bookmarkStart w:id="16" w:name="_Toc215168245"/>
       <w:r>
         <w:rPr>
           <w:kern w:val="32"/>
@@ -7276,7 +7081,7 @@
         </w:rPr>
         <w:br w:type="page"/>
       </w:r>
-      <w:bookmarkStart w:id="17" w:name="_Toc215163921"/>
+      <w:bookmarkStart w:id="17" w:name="_Toc215168246"/>
       <w:r>
         <w:rPr>
           <w:kern w:val="32"/>
@@ -7769,6 +7574,307 @@
         <w:t>Бекас</w:t>
       </w:r>
     </w:p>
+    <w:p>
+      <w:pPr>
+        <w:ind w:firstLine="0"/>
+        <w:rPr>
+          <w:lang w:eastAsia="en-US"/>
+        </w:rPr>
+      </w:pPr>
+      <w:r>
+        <w:rPr>
+          <w:lang w:eastAsia="en-US"/>
+        </w:rPr>
+        <w:t xml:space="preserve">Варианты загрузки данных </w:t>
+      </w:r>
+      <w:r>
+        <w:rPr>
+          <w:lang w:val="en-US" w:eastAsia="en-US"/>
+        </w:rPr>
+        <w:t>Landsat</w:t>
+      </w:r>
+      <w:r>
+        <w:rPr>
+          <w:lang w:eastAsia="en-US"/>
+        </w:rPr>
+        <w:t xml:space="preserve"> 8</w:t>
+      </w:r>
+      <w:r>
+        <w:rPr>
+          <w:lang w:eastAsia="en-US"/>
+        </w:rPr>
+        <w:t xml:space="preserve">, </w:t>
+      </w:r>
+      <w:r>
+        <w:rPr>
+          <w:lang w:eastAsia="en-US"/>
+        </w:rPr>
+        <w:t>9</w:t>
+      </w:r>
+      <w:r>
+        <w:rPr>
+          <w:lang w:eastAsia="en-US"/>
+        </w:rPr>
+        <w:t xml:space="preserve">, </w:t>
+      </w:r>
+      <w:proofErr w:type="spellStart"/>
+      <w:r>
+        <w:rPr>
+          <w:lang w:eastAsia="en-US"/>
+        </w:rPr>
+        <w:t>Sentinel</w:t>
+      </w:r>
+      <w:proofErr w:type="spellEnd"/>
+      <w:r>
+        <w:rPr>
+          <w:lang w:eastAsia="en-US"/>
+        </w:rPr>
+        <w:t xml:space="preserve"> 2</w:t>
+      </w:r>
+      <w:r>
+        <w:rPr>
+          <w:lang w:val="en-US" w:eastAsia="en-US"/>
+        </w:rPr>
+        <w:t>A</w:t>
+      </w:r>
+      <w:r>
+        <w:rPr>
+          <w:lang w:eastAsia="en-US"/>
+        </w:rPr>
+        <w:t>, 2</w:t>
+      </w:r>
+      <w:r>
+        <w:rPr>
+          <w:lang w:val="en-US" w:eastAsia="en-US"/>
+        </w:rPr>
+        <w:t>B</w:t>
+      </w:r>
+      <w:r>
+        <w:rPr>
+          <w:lang w:eastAsia="en-US"/>
+        </w:rPr>
+        <w:t xml:space="preserve"> </w:t>
+      </w:r>
+      <w:r>
+        <w:rPr>
+          <w:lang w:eastAsia="en-US"/>
+        </w:rPr>
+        <w:t>приведены на рисунках</w:t>
+      </w:r>
+      <w:r>
+        <w:rPr>
+          <w:lang w:eastAsia="en-US"/>
+        </w:rPr>
+        <w:t xml:space="preserve"> 3.3, 3.4, 3.5, 3.6.</w:t>
+      </w:r>
+      <w:r>
+        <w:rPr>
+          <w:lang w:eastAsia="en-US"/>
+        </w:rPr>
+        <w:t xml:space="preserve"> </w:t>
+      </w:r>
+    </w:p>
+    <w:p>
+      <w:pPr>
+        <w:ind w:firstLine="0"/>
+        <w:jc w:val="center"/>
+        <w:rPr>
+          <w:lang w:eastAsia="en-US"/>
+        </w:rPr>
+      </w:pPr>
+      <w:r>
+        <w:rPr>
+          <w:lang w:eastAsia="en-US"/>
+        </w:rPr>
+        <w:lastRenderedPageBreak/>
+        <w:drawing>
+          <wp:inline distT="0" distB="0" distL="0" distR="0" wp14:anchorId="7C2CB88F" wp14:editId="11CEE257">
+            <wp:extent cx="6228080" cy="3503295"/>
+            <wp:effectExtent l="0" t="0" r="1270" b="1905"/>
+            <wp:docPr id="4" name="Рисунок 4"/>
+            <wp:cNvGraphicFramePr>
+              <a:graphicFrameLocks xmlns:a="http://schemas.openxmlformats.org/drawingml/2006/main" noChangeAspect="1"/>
+            </wp:cNvGraphicFramePr>
+            <a:graphic xmlns:a="http://schemas.openxmlformats.org/drawingml/2006/main">
+              <a:graphicData uri="http://schemas.openxmlformats.org/drawingml/2006/picture">
+                <pic:pic xmlns:pic="http://schemas.openxmlformats.org/drawingml/2006/picture">
+                  <pic:nvPicPr>
+                    <pic:cNvPr id="1" name=""/>
+                    <pic:cNvPicPr/>
+                  </pic:nvPicPr>
+                  <pic:blipFill>
+                    <a:blip r:embed="rId15"/>
+                    <a:stretch>
+                      <a:fillRect/>
+                    </a:stretch>
+                  </pic:blipFill>
+                  <pic:spPr>
+                    <a:xfrm>
+                      <a:off x="0" y="0"/>
+                      <a:ext cx="6228080" cy="3503295"/>
+                    </a:xfrm>
+                    <a:prstGeom prst="rect">
+                      <a:avLst/>
+                    </a:prstGeom>
+                  </pic:spPr>
+                </pic:pic>
+              </a:graphicData>
+            </a:graphic>
+          </wp:inline>
+        </w:drawing>
+      </w:r>
+    </w:p>
+    <w:p>
+      <w:pPr>
+        <w:ind w:firstLine="0"/>
+        <w:jc w:val="center"/>
+        <w:rPr>
+          <w:lang w:eastAsia="en-US"/>
+        </w:rPr>
+      </w:pPr>
+      <w:r>
+        <w:rPr>
+          <w:lang w:eastAsia="en-US"/>
+        </w:rPr>
+        <w:t xml:space="preserve">Рисунок </w:t>
+      </w:r>
+      <w:r>
+        <w:rPr>
+          <w:lang w:eastAsia="en-US"/>
+        </w:rPr>
+        <w:t>3.3</w:t>
+      </w:r>
+      <w:r>
+        <w:rPr>
+          <w:lang w:eastAsia="en-US"/>
+        </w:rPr>
+        <w:t xml:space="preserve"> </w:t>
+      </w:r>
+      <w:r>
+        <w:rPr>
+          <w:lang w:eastAsia="en-US"/>
+        </w:rPr>
+        <w:t xml:space="preserve">- </w:t>
+      </w:r>
+      <w:r>
+        <w:rPr>
+          <w:lang w:eastAsia="en-US"/>
+        </w:rPr>
+        <w:t xml:space="preserve">Внешний вид загруженных данных </w:t>
+      </w:r>
+      <w:r>
+        <w:rPr>
+          <w:lang w:val="en-US" w:eastAsia="en-US"/>
+        </w:rPr>
+        <w:t>Landsat</w:t>
+      </w:r>
+      <w:r>
+        <w:rPr>
+          <w:lang w:eastAsia="en-US"/>
+        </w:rPr>
+        <w:t xml:space="preserve"> 9</w:t>
+      </w:r>
+    </w:p>
+    <w:p>
+      <w:pPr>
+        <w:tabs>
+          <w:tab w:val="left" w:pos="6749"/>
+        </w:tabs>
+        <w:ind w:firstLine="0"/>
+        <w:jc w:val="left"/>
+        <w:rPr>
+          <w:lang w:eastAsia="en-US"/>
+        </w:rPr>
+      </w:pPr>
+      <w:r>
+        <w:rPr>
+          <w:lang w:eastAsia="en-US"/>
+        </w:rPr>
+        <w:tab/>
+      </w:r>
+      <w:r>
+        <w:rPr>
+          <w:lang w:eastAsia="en-US"/>
+        </w:rPr>
+        <w:drawing>
+          <wp:inline distT="0" distB="0" distL="0" distR="0" wp14:anchorId="00243FDC" wp14:editId="3D8B98A6">
+            <wp:extent cx="6228080" cy="3503295"/>
+            <wp:effectExtent l="0" t="0" r="1270" b="1905"/>
+            <wp:docPr id="5" name="Рисунок 5"/>
+            <wp:cNvGraphicFramePr>
+              <a:graphicFrameLocks xmlns:a="http://schemas.openxmlformats.org/drawingml/2006/main" noChangeAspect="1"/>
+            </wp:cNvGraphicFramePr>
+            <a:graphic xmlns:a="http://schemas.openxmlformats.org/drawingml/2006/main">
+              <a:graphicData uri="http://schemas.openxmlformats.org/drawingml/2006/picture">
+                <pic:pic xmlns:pic="http://schemas.openxmlformats.org/drawingml/2006/picture">
+                  <pic:nvPicPr>
+                    <pic:cNvPr id="1" name=""/>
+                    <pic:cNvPicPr/>
+                  </pic:nvPicPr>
+                  <pic:blipFill>
+                    <a:blip r:embed="rId16"/>
+                    <a:stretch>
+                      <a:fillRect/>
+                    </a:stretch>
+                  </pic:blipFill>
+                  <pic:spPr>
+                    <a:xfrm>
+                      <a:off x="0" y="0"/>
+                      <a:ext cx="6228080" cy="3503295"/>
+                    </a:xfrm>
+                    <a:prstGeom prst="rect">
+                      <a:avLst/>
+                    </a:prstGeom>
+                  </pic:spPr>
+                </pic:pic>
+              </a:graphicData>
+            </a:graphic>
+          </wp:inline>
+        </w:drawing>
+      </w:r>
+    </w:p>
+    <w:p>
+      <w:pPr>
+        <w:tabs>
+          <w:tab w:val="left" w:pos="5405"/>
+        </w:tabs>
+        <w:ind w:firstLine="0"/>
+        <w:jc w:val="center"/>
+        <w:rPr>
+          <w:lang w:eastAsia="en-US"/>
+        </w:rPr>
+      </w:pPr>
+      <w:r>
+        <w:rPr>
+          <w:lang w:eastAsia="en-US"/>
+        </w:rPr>
+        <w:t xml:space="preserve">Рисунок 3.4 - </w:t>
+      </w:r>
+      <w:r>
+        <w:rPr>
+          <w:lang w:eastAsia="en-US"/>
+        </w:rPr>
+        <w:t>Внешний вид загруженных данных</w:t>
+      </w:r>
+      <w:r>
+        <w:rPr>
+          <w:lang w:eastAsia="en-US"/>
+        </w:rPr>
+        <w:t xml:space="preserve"> </w:t>
+      </w:r>
+      <w:r>
+        <w:rPr>
+          <w:lang w:val="en-US" w:eastAsia="en-US"/>
+        </w:rPr>
+        <w:t>Landsat</w:t>
+      </w:r>
+      <w:r>
+        <w:rPr>
+          <w:lang w:eastAsia="en-US"/>
+        </w:rPr>
+        <w:t xml:space="preserve"> 8</w:t>
+      </w:r>
+    </w:p>
     <w:bookmarkEnd w:id="18"/>
     <w:p>
       <w:pPr>
@@ -7825,12 +7931,19 @@
         <w:rPr>
           <w:lang w:eastAsia="en-US"/>
         </w:rPr>
-        <w:t xml:space="preserve">. Для общей проверки программы </w:t>
+        <w:t>. Для общей про</w:t>
       </w:r>
       <w:r>
         <w:rPr>
           <w:lang w:eastAsia="en-US"/>
         </w:rPr>
+        <w:lastRenderedPageBreak/>
+        <w:t xml:space="preserve">верки программы </w:t>
+      </w:r>
+      <w:r>
+        <w:rPr>
+          <w:lang w:eastAsia="en-US"/>
+        </w:rPr>
         <w:t xml:space="preserve">модуля </w:t>
       </w:r>
       <w:r>
@@ -7845,6 +7958,338 @@
         </w:rPr>
         <w:t>убедиться, что данные отображаются в соответствии с рисунком 3.</w:t>
       </w:r>
+    </w:p>
+    <w:p>
+      <w:pPr>
+        <w:ind w:firstLine="0"/>
+        <w:rPr>
+          <w:lang w:eastAsia="en-US"/>
+        </w:rPr>
+      </w:pPr>
+      <w:r>
+        <w:rPr>
+          <w:lang w:eastAsia="en-US"/>
+        </w:rPr>
+        <w:drawing>
+          <wp:inline distT="0" distB="0" distL="0" distR="0" wp14:anchorId="6A26D695" wp14:editId="6C2A8F5E">
+            <wp:extent cx="6228080" cy="3503295"/>
+            <wp:effectExtent l="0" t="0" r="1270" b="1905"/>
+            <wp:docPr id="6" name="Рисунок 6"/>
+            <wp:cNvGraphicFramePr>
+              <a:graphicFrameLocks xmlns:a="http://schemas.openxmlformats.org/drawingml/2006/main" noChangeAspect="1"/>
+            </wp:cNvGraphicFramePr>
+            <a:graphic xmlns:a="http://schemas.openxmlformats.org/drawingml/2006/main">
+              <a:graphicData uri="http://schemas.openxmlformats.org/drawingml/2006/picture">
+                <pic:pic xmlns:pic="http://schemas.openxmlformats.org/drawingml/2006/picture">
+                  <pic:nvPicPr>
+                    <pic:cNvPr id="1" name=""/>
+                    <pic:cNvPicPr/>
+                  </pic:nvPicPr>
+                  <pic:blipFill>
+                    <a:blip r:embed="rId17"/>
+                    <a:stretch>
+                      <a:fillRect/>
+                    </a:stretch>
+                  </pic:blipFill>
+                  <pic:spPr>
+                    <a:xfrm>
+                      <a:off x="0" y="0"/>
+                      <a:ext cx="6228080" cy="3503295"/>
+                    </a:xfrm>
+                    <a:prstGeom prst="rect">
+                      <a:avLst/>
+                    </a:prstGeom>
+                  </pic:spPr>
+                </pic:pic>
+              </a:graphicData>
+            </a:graphic>
+          </wp:inline>
+        </w:drawing>
+      </w:r>
+    </w:p>
+    <w:p>
+      <w:pPr>
+        <w:ind w:firstLine="0"/>
+        <w:jc w:val="center"/>
+        <w:rPr>
+          <w:lang w:eastAsia="en-US"/>
+        </w:rPr>
+      </w:pPr>
+      <w:r>
+        <w:rPr>
+          <w:lang w:eastAsia="en-US"/>
+        </w:rPr>
+        <w:t>Рисунок 3.</w:t>
+      </w:r>
+      <w:r>
+        <w:rPr>
+          <w:lang w:eastAsia="en-US"/>
+        </w:rPr>
+        <w:t>5 - Внешний</w:t>
+      </w:r>
+      <w:r>
+        <w:rPr>
+          <w:lang w:eastAsia="en-US"/>
+        </w:rPr>
+        <w:t xml:space="preserve"> вид загруженных данных </w:t>
+      </w:r>
+      <w:r>
+        <w:rPr>
+          <w:lang w:val="en-US" w:eastAsia="en-US"/>
+        </w:rPr>
+        <w:t>Sentinel</w:t>
+      </w:r>
+      <w:r>
+        <w:rPr>
+          <w:lang w:eastAsia="en-US"/>
+        </w:rPr>
+        <w:t xml:space="preserve"> 2</w:t>
+      </w:r>
+      <w:r>
+        <w:rPr>
+          <w:lang w:val="en-US" w:eastAsia="en-US"/>
+        </w:rPr>
+        <w:t>A</w:t>
+      </w:r>
+    </w:p>
+    <w:p>
+      <w:pPr>
+        <w:ind w:firstLine="0"/>
+        <w:jc w:val="center"/>
+        <w:rPr>
+          <w:lang w:eastAsia="en-US"/>
+        </w:rPr>
+      </w:pPr>
+    </w:p>
+    <w:p>
+      <w:pPr>
+        <w:ind w:firstLine="0"/>
+        <w:jc w:val="center"/>
+        <w:rPr>
+          <w:lang w:eastAsia="en-US"/>
+        </w:rPr>
+      </w:pPr>
+      <w:r>
+        <w:rPr>
+          <w:lang w:eastAsia="en-US"/>
+        </w:rPr>
+        <w:drawing>
+          <wp:inline distT="0" distB="0" distL="0" distR="0" wp14:anchorId="3576CCE4" wp14:editId="36A68BFE">
+            <wp:extent cx="6228080" cy="3503295"/>
+            <wp:effectExtent l="0" t="0" r="1270" b="1905"/>
+            <wp:docPr id="7" name="Рисунок 7"/>
+            <wp:cNvGraphicFramePr>
+              <a:graphicFrameLocks xmlns:a="http://schemas.openxmlformats.org/drawingml/2006/main" noChangeAspect="1"/>
+            </wp:cNvGraphicFramePr>
+            <a:graphic xmlns:a="http://schemas.openxmlformats.org/drawingml/2006/main">
+              <a:graphicData uri="http://schemas.openxmlformats.org/drawingml/2006/picture">
+                <pic:pic xmlns:pic="http://schemas.openxmlformats.org/drawingml/2006/picture">
+                  <pic:nvPicPr>
+                    <pic:cNvPr id="1" name=""/>
+                    <pic:cNvPicPr/>
+                  </pic:nvPicPr>
+                  <pic:blipFill>
+                    <a:blip r:embed="rId18"/>
+                    <a:stretch>
+                      <a:fillRect/>
+                    </a:stretch>
+                  </pic:blipFill>
+                  <pic:spPr>
+                    <a:xfrm>
+                      <a:off x="0" y="0"/>
+                      <a:ext cx="6228080" cy="3503295"/>
+                    </a:xfrm>
+                    <a:prstGeom prst="rect">
+                      <a:avLst/>
+                    </a:prstGeom>
+                  </pic:spPr>
+                </pic:pic>
+              </a:graphicData>
+            </a:graphic>
+          </wp:inline>
+        </w:drawing>
+      </w:r>
+    </w:p>
+    <w:p>
+      <w:pPr>
+        <w:ind w:firstLine="0"/>
+        <w:jc w:val="center"/>
+        <w:rPr>
+          <w:lang w:eastAsia="en-US"/>
+        </w:rPr>
+      </w:pPr>
+      <w:r>
+        <w:rPr>
+          <w:lang w:eastAsia="en-US"/>
+        </w:rPr>
+        <w:t xml:space="preserve">Рисунок </w:t>
+      </w:r>
+      <w:r>
+        <w:rPr>
+          <w:lang w:eastAsia="en-US"/>
+        </w:rPr>
+        <w:t xml:space="preserve">3.6 - </w:t>
+      </w:r>
+      <w:r>
+        <w:rPr>
+          <w:lang w:eastAsia="en-US"/>
+        </w:rPr>
+        <w:t xml:space="preserve">Внешний вид загруженных данных </w:t>
+      </w:r>
+      <w:r>
+        <w:rPr>
+          <w:lang w:val="en-US" w:eastAsia="en-US"/>
+        </w:rPr>
+        <w:t>Sentinel</w:t>
+      </w:r>
+      <w:r>
+        <w:rPr>
+          <w:lang w:eastAsia="en-US"/>
+        </w:rPr>
+        <w:t xml:space="preserve"> 2</w:t>
+      </w:r>
+      <w:r>
+        <w:rPr>
+          <w:lang w:val="en-US" w:eastAsia="en-US"/>
+        </w:rPr>
+        <w:t>B</w:t>
+      </w:r>
+    </w:p>
+    <w:p>
+      <w:pPr>
+        <w:ind w:firstLine="0"/>
+        <w:rPr>
+          <w:lang w:eastAsia="en-US"/>
+        </w:rPr>
+      </w:pPr>
+      <w:r>
+        <w:rPr>
+          <w:lang w:eastAsia="en-US"/>
+        </w:rPr>
+        <w:lastRenderedPageBreak/>
+        <w:drawing>
+          <wp:inline distT="0" distB="0" distL="0" distR="0" wp14:anchorId="0F6564C0" wp14:editId="67899025">
+            <wp:extent cx="6228080" cy="3503295"/>
+            <wp:effectExtent l="0" t="0" r="1270" b="1905"/>
+            <wp:docPr id="8" name="Рисунок 8"/>
+            <wp:cNvGraphicFramePr>
+              <a:graphicFrameLocks xmlns:a="http://schemas.openxmlformats.org/drawingml/2006/main" noChangeAspect="1"/>
+            </wp:cNvGraphicFramePr>
+            <a:graphic xmlns:a="http://schemas.openxmlformats.org/drawingml/2006/main">
+              <a:graphicData uri="http://schemas.openxmlformats.org/drawingml/2006/picture">
+                <pic:pic xmlns:pic="http://schemas.openxmlformats.org/drawingml/2006/picture">
+                  <pic:nvPicPr>
+                    <pic:cNvPr id="1" name=""/>
+                    <pic:cNvPicPr/>
+                  </pic:nvPicPr>
+                  <pic:blipFill>
+                    <a:blip r:embed="rId19"/>
+                    <a:stretch>
+                      <a:fillRect/>
+                    </a:stretch>
+                  </pic:blipFill>
+                  <pic:spPr>
+                    <a:xfrm>
+                      <a:off x="0" y="0"/>
+                      <a:ext cx="6228080" cy="3503295"/>
+                    </a:xfrm>
+                    <a:prstGeom prst="rect">
+                      <a:avLst/>
+                    </a:prstGeom>
+                  </pic:spPr>
+                </pic:pic>
+              </a:graphicData>
+            </a:graphic>
+          </wp:inline>
+        </w:drawing>
+      </w:r>
+    </w:p>
+    <w:p>
+      <w:pPr>
+        <w:ind w:firstLine="0"/>
+        <w:jc w:val="center"/>
+        <w:rPr>
+          <w:lang w:eastAsia="en-US"/>
+        </w:rPr>
+      </w:pPr>
+    </w:p>
+    <w:p>
+      <w:pPr>
+        <w:ind w:firstLine="0"/>
+        <w:jc w:val="center"/>
+        <w:rPr>
+          <w:lang w:eastAsia="en-US"/>
+        </w:rPr>
+      </w:pPr>
+      <w:r>
+        <w:rPr>
+          <w:lang w:eastAsia="en-US"/>
+        </w:rPr>
+        <w:t>Рисунок 3.</w:t>
+      </w:r>
+      <w:r>
+        <w:rPr>
+          <w:lang w:eastAsia="en-US"/>
+        </w:rPr>
+        <w:t xml:space="preserve">7 </w:t>
+      </w:r>
+      <w:r>
+        <w:rPr>
+          <w:lang w:eastAsia="en-US"/>
+        </w:rPr>
+        <w:t>- Пример</w:t>
+      </w:r>
+      <w:r>
+        <w:rPr>
+          <w:lang w:eastAsia="en-US"/>
+        </w:rPr>
+        <w:t xml:space="preserve"> данных </w:t>
+      </w:r>
+      <w:r>
+        <w:rPr>
+          <w:lang w:val="en-US" w:eastAsia="en-US"/>
+        </w:rPr>
+        <w:t>Sentinel</w:t>
+      </w:r>
+      <w:r>
+        <w:rPr>
+          <w:lang w:eastAsia="en-US"/>
+        </w:rPr>
+        <w:t xml:space="preserve"> 2</w:t>
+      </w:r>
+      <w:r>
+        <w:rPr>
+          <w:lang w:val="en-US" w:eastAsia="en-US"/>
+        </w:rPr>
+        <w:t>A</w:t>
+      </w:r>
+      <w:r>
+        <w:rPr>
+          <w:lang w:eastAsia="en-US"/>
+        </w:rPr>
+        <w:t xml:space="preserve"> </w:t>
+      </w:r>
+      <w:r>
+        <w:rPr>
+          <w:lang w:eastAsia="en-US"/>
+        </w:rPr>
+        <w:t xml:space="preserve">с модифицированным </w:t>
+      </w:r>
+      <w:r>
+        <w:rPr>
+          <w:lang w:val="en-US" w:eastAsia="en-US"/>
+        </w:rPr>
+        <w:t>RGB</w:t>
+      </w:r>
+    </w:p>
+    <w:p>
+      <w:pPr>
+        <w:ind w:firstLine="0"/>
+        <w:jc w:val="center"/>
+        <w:rPr>
+          <w:lang w:eastAsia="en-US"/>
+        </w:rPr>
+      </w:pPr>
     </w:p>
     <w:p>
       <w:pPr>
@@ -7876,7 +8321,6 @@
         <w:rPr>
           <w:lang w:eastAsia="en-US"/>
         </w:rPr>
-        <w:lastRenderedPageBreak/>
         <w:t>ма</w:t>
       </w:r>
       <w:proofErr w:type="spellEnd"/>
@@ -7926,7 +8370,7 @@
         </w:rPr>
         <w:br w:type="page"/>
       </w:r>
-      <w:bookmarkStart w:id="19" w:name="_Toc215163922"/>
+      <w:bookmarkStart w:id="19" w:name="_Toc215168247"/>
       <w:r>
         <w:rPr>
           <w:lang w:eastAsia="en-US"/>
@@ -8003,7 +8447,7 @@
         </w:rPr>
         <w:br w:type="page"/>
       </w:r>
-      <w:bookmarkStart w:id="20" w:name="_Toc215163927"/>
+      <w:bookmarkStart w:id="20" w:name="_Toc215168248"/>
       <w:r>
         <w:rPr>
           <w:lang w:eastAsia="en-US"/>
@@ -8050,7 +8494,19 @@
         <w:rPr>
           <w:lang w:eastAsia="en-US"/>
         </w:rPr>
-        <w:t xml:space="preserve">, а именно простого копирования файлов на жесткий диск компьютера, сообщения системному программисту в ходе настройки </w:t>
+        <w:t xml:space="preserve">, а именно простого </w:t>
+      </w:r>
+      <w:r>
+        <w:rPr>
+          <w:lang w:eastAsia="en-US"/>
+        </w:rPr>
+        <w:t>запуска установочного файла</w:t>
+      </w:r>
+      <w:r>
+        <w:rPr>
+          <w:lang w:eastAsia="en-US"/>
+        </w:rPr>
+        <w:t xml:space="preserve">, сообщения системному программисту в ходе настройки </w:t>
       </w:r>
       <w:r>
         <w:rPr>
@@ -8176,7 +8632,7 @@
       <w:bookmarkStart w:id="22" w:name="_Toc359236205"/>
       <w:bookmarkStart w:id="23" w:name="_Toc370222974"/>
       <w:bookmarkStart w:id="24" w:name="_Toc492474358"/>
-      <w:bookmarkStart w:id="25" w:name="_Toc215163928"/>
+      <w:bookmarkStart w:id="25" w:name="_Toc215168249"/>
       <w:bookmarkEnd w:id="9"/>
       <w:r>
         <w:rPr>
@@ -14314,9 +14770,9 @@
       </w:pPr>
     </w:p>
     <w:sectPr>
-      <w:headerReference w:type="default" r:id="rId15"/>
-      <w:headerReference w:type="first" r:id="rId16"/>
-      <w:footerReference w:type="first" r:id="rId17"/>
+      <w:headerReference w:type="default" r:id="rId20"/>
+      <w:headerReference w:type="first" r:id="rId21"/>
+      <w:footerReference w:type="first" r:id="rId22"/>
       <w:pgSz w:w="11906" w:h="16838" w:code="9"/>
       <w:pgMar w:top="439" w:right="567" w:bottom="1418" w:left="1531" w:header="0" w:footer="0" w:gutter="0"/>
       <w:cols w:space="720"/>
@@ -21908,6 +22364,7 @@
   <w:style w:type="character" w:default="1" w:styleId="a1">
     <w:name w:val="Default Paragraph Font"/>
     <w:uiPriority w:val="1"/>
+    <w:semiHidden/>
     <w:unhideWhenUsed/>
   </w:style>
   <w:style w:type="table" w:default="1" w:styleId="a2">

</xml_diff>